<commit_message>
feat(import): strict file extension validation, duplicate rejection, and mandatory email/name checks with reasons
</commit_message>
<xml_diff>
--- a/Coding_Module_and_Test_Case_Submission.docx
+++ b/Coding_Module_and_Test_Case_Submission.docx
@@ -2263,7 +2263,7 @@
           <w:color w:val="646464"/>
           <w:sz w:val="19"/>
         </w:rPr>
-        <w:t>Testing Excel file parsing, validation, duplicate registration checks, and mandatory Email/Registration requirements.</w:t>
+        <w:t>Testing Excel/CSV upload, duplicate rejection, missing name/email validation with reasons, and file format checks.</w:t>
       </w:r>
     </w:p>
     <w:tbl>
@@ -2467,7 +2467,7 @@
               <w:rPr>
                 <w:sz w:val="18"/>
               </w:rPr>
-              <w:t>Bulk import students using valid Excel sheet</w:t>
+              <w:t>Bulk import students using valid Excel or CSV sheet</w:t>
             </w:r>
           </w:p>
         </w:tc>
@@ -2486,7 +2486,7 @@
               <w:rPr>
                 <w:sz w:val="18"/>
               </w:rPr>
-              <w:t>Valid .xlsx file with student records containing Reg No, Name, Email</w:t>
+              <w:t>Valid .xlsx or .csv file containing Registration No, Name, and Email</w:t>
             </w:r>
           </w:p>
         </w:tc>
@@ -2505,7 +2505,7 @@
               <w:rPr>
                 <w:sz w:val="18"/>
               </w:rPr>
-              <w:t>All student records imported successfully into database</w:t>
+              <w:t>All student records parsed and imported successfully into database</w:t>
             </w:r>
           </w:p>
         </w:tc>
@@ -2524,7 +2524,7 @@
               <w:rPr>
                 <w:sz w:val="18"/>
               </w:rPr>
-              <w:t>Students imported successfully</w:t>
+              <w:t>Students imported successfully with success summary toast</w:t>
             </w:r>
           </w:p>
         </w:tc>
@@ -2592,7 +2592,7 @@
               <w:rPr>
                 <w:sz w:val="18"/>
               </w:rPr>
-              <w:t>Import student with duplicate Registration Number</w:t>
+              <w:t>Duplicate student registration number rejected</w:t>
             </w:r>
           </w:p>
         </w:tc>
@@ -2611,7 +2611,7 @@
               <w:rPr>
                 <w:sz w:val="18"/>
               </w:rPr>
-              <w:t>Student with already existing Registration Number in DB</w:t>
+              <w:t>Excel sheet with duplicate Registration Number (e.g. 240434 repeated in Row 8)</w:t>
             </w:r>
           </w:p>
         </w:tc>
@@ -2630,7 +2630,7 @@
               <w:rPr>
                 <w:sz w:val="18"/>
               </w:rPr>
-              <w:t>System rejects duplicate and displays conflict warning</w:t>
+              <w:t>Duplicate row is detected and rejected; unique records imported</w:t>
             </w:r>
           </w:p>
         </w:tc>
@@ -2649,7 +2649,7 @@
               <w:rPr>
                 <w:sz w:val="18"/>
               </w:rPr>
-              <w:t>Duplicate registration number rejected</w:t>
+              <w:t>Warning displayed: Row 8 Duplicate Registration No 240434 rejected (skipped)</w:t>
             </w:r>
           </w:p>
         </w:tc>
@@ -2717,7 +2717,7 @@
               <w:rPr>
                 <w:sz w:val="18"/>
               </w:rPr>
-              <w:t>Import Excel sheet with missing required fields (Email, Reg No, or Name)</w:t>
+              <w:t>Missing required fields (Email / Name) rejected with reason</w:t>
             </w:r>
           </w:p>
         </w:tc>
@@ -2736,7 +2736,7 @@
               <w:rPr>
                 <w:sz w:val="18"/>
               </w:rPr>
-              <w:t>Excel file with blank Email address or Registration Number in row 5</w:t>
+              <w:t>Excel file with missing Email in Row 4, and missing Student Name in Row 9</w:t>
             </w:r>
           </w:p>
         </w:tc>
@@ -2755,7 +2755,7 @@
               <w:rPr>
                 <w:sz w:val="18"/>
               </w:rPr>
-              <w:t>Row 5 flagged as invalid due to missing Email/required field; remaining valid rows imported</w:t>
+              <w:t>Specific rows rejected with exact failure reasons shown on screen</w:t>
             </w:r>
           </w:p>
         </w:tc>
@@ -2774,7 +2774,7 @@
               <w:rPr>
                 <w:sz w:val="18"/>
               </w:rPr>
-              <w:t>Alert displayed: '1 invalid row (missing registration number, name, or email) will be skipped'</w:t>
+              <w:t>Alert displayed: Row 4: Missing email address; Row 9: Missing student name</w:t>
             </w:r>
           </w:p>
         </w:tc>
@@ -2842,7 +2842,7 @@
               <w:rPr>
                 <w:sz w:val="18"/>
               </w:rPr>
-              <w:t>Upload unsupported file format for import</w:t>
+              <w:t>Full file rejection on unsupported format (.pdf / .png / images)</w:t>
             </w:r>
           </w:p>
         </w:tc>
@@ -2861,7 +2861,7 @@
               <w:rPr>
                 <w:sz w:val="18"/>
               </w:rPr>
-              <w:t>Non-excel file uploaded (e.g., .pdf or .png)</w:t>
+              <w:t>Uploading a PDF (.pdf) or PNG (.png) document instead of spreadsheet</w:t>
             </w:r>
           </w:p>
         </w:tc>
@@ -2880,7 +2880,7 @@
               <w:rPr>
                 <w:sz w:val="18"/>
               </w:rPr>
-              <w:t>System rejects file and prompts for .xlsx format</w:t>
+              <w:t>Full file upload rejected immediately with error prompt; no processing</w:t>
             </w:r>
           </w:p>
         </w:tc>
@@ -2899,7 +2899,7 @@
               <w:rPr>
                 <w:sz w:val="18"/>
               </w:rPr>
-              <w:t>File format error is displayed</w:t>
+              <w:t>Upload blocked; error: 'File rejected: .pdf is not supported. Only Excel/CSV allowed'</w:t>
             </w:r>
           </w:p>
         </w:tc>

</xml_diff>